<commit_message>
Update Referencing GADE6221 Part 1.docx
</commit_message>
<xml_diff>
--- a/Referencing GADE6221 Part 1.docx
+++ b/Referencing GADE6221 Part 1.docx
@@ -80,15 +80,20 @@
           <w:szCs w:val="32"/>
         </w:rPr>
       </w:pPr>
-      <w:r>
-        <w:t xml:space="preserve">Mellow Fox Studios, 2024. </w:t>
+      <w:proofErr w:type="spellStart"/>
+      <w:r>
+        <w:t>GDTitans</w:t>
+      </w:r>
+      <w:proofErr w:type="spellEnd"/>
+      <w:r>
+        <w:t xml:space="preserve">, 2019. </w:t>
       </w:r>
       <w:r>
         <w:rPr>
           <w:i/>
           <w:iCs/>
         </w:rPr>
-        <w:t xml:space="preserve">Versatile Building Kit – 15 Medium Poly Models </w:t>
+        <w:t xml:space="preserve">Unity Endless Game – Part </w:t>
       </w:r>
       <w:proofErr w:type="gramStart"/>
       <w:r>
@@ -96,7 +101,7 @@
           <w:i/>
           <w:iCs/>
         </w:rPr>
-        <w:t>For</w:t>
+        <w:t>2 :</w:t>
       </w:r>
       <w:proofErr w:type="gramEnd"/>
       <w:r>
@@ -104,19 +109,74 @@
           <w:i/>
           <w:iCs/>
         </w:rPr>
-        <w:t xml:space="preserve"> Game Development</w:t>
+        <w:t xml:space="preserve"> Moving The Player (moving left and right). </w:t>
+      </w:r>
+      <w:r>
+        <w:t xml:space="preserve">[YouTube video] Available at: </w:t>
+      </w:r>
+      <w:hyperlink r:id="rId6" w:history="1">
+        <w:r>
+          <w:rPr>
+            <w:rStyle w:val="Hyperlink"/>
+          </w:rPr>
+          <w:t>https://www.youtube.com/watch?v=MwvmNyYKgwA</w:t>
+        </w:r>
+      </w:hyperlink>
+      <w:r>
+        <w:t xml:space="preserve"> [Accessed 3 April 2025].</w:t>
+      </w:r>
+    </w:p>
+    <w:p>
+      <w:pPr>
+        <w:pStyle w:val="ListParagraph"/>
+        <w:numPr>
+          <w:ilvl w:val="0"/>
+          <w:numId w:val="1"/>
+        </w:numPr>
+        <w:rPr>
+          <w:b/>
+          <w:bCs/>
+          <w:sz w:val="32"/>
+          <w:szCs w:val="32"/>
+        </w:rPr>
+      </w:pPr>
+      <w:r>
+        <w:t xml:space="preserve">Mellow Fox Studios, 2024. </w:t>
       </w:r>
       <w:r>
         <w:rPr>
           <w:i/>
           <w:iCs/>
         </w:rPr>
+        <w:t xml:space="preserve">Versatile Building Kit – 15 Medium Poly Models </w:t>
+      </w:r>
+      <w:proofErr w:type="gramStart"/>
+      <w:r>
+        <w:rPr>
+          <w:i/>
+          <w:iCs/>
+        </w:rPr>
+        <w:t>For</w:t>
+      </w:r>
+      <w:proofErr w:type="gramEnd"/>
+      <w:r>
+        <w:rPr>
+          <w:i/>
+          <w:iCs/>
+        </w:rPr>
+        <w:t xml:space="preserve"> Game Development</w:t>
+      </w:r>
+      <w:r>
+        <w:rPr>
+          <w:i/>
+          <w:iCs/>
+        </w:rPr>
         <w:t xml:space="preserve">. </w:t>
       </w:r>
       <w:r>
         <w:t xml:space="preserve">[Unity Asset]. Available at </w:t>
       </w:r>
-      <w:hyperlink r:id="rId6" w:history="1">
+      <w:hyperlink r:id="rId7" w:history="1">
         <w:r>
           <w:rPr>
             <w:rStyle w:val="Hyperlink"/>
@@ -155,7 +215,7 @@
       <w:r>
         <w:t xml:space="preserve">[Unity Asset]. Available at: </w:t>
       </w:r>
-      <w:hyperlink r:id="rId7" w:history="1">
+      <w:hyperlink r:id="rId8" w:history="1">
         <w:r>
           <w:rPr>
             <w:rStyle w:val="Hyperlink"/>
@@ -194,7 +254,7 @@
       <w:r>
         <w:t xml:space="preserve">[Unity Asset]. Available at: </w:t>
       </w:r>
-      <w:hyperlink r:id="rId8" w:history="1">
+      <w:hyperlink r:id="rId9" w:history="1">
         <w:r>
           <w:rPr>
             <w:rStyle w:val="Hyperlink"/>
@@ -221,19 +281,58 @@
         </w:rPr>
       </w:pPr>
       <w:r>
-        <w:t xml:space="preserve">VenCreations, 2017. </w:t>
+        <w:t xml:space="preserve">Quick n Dirty, 2020. </w:t>
       </w:r>
       <w:r>
         <w:rPr>
           <w:i/>
           <w:iCs/>
         </w:rPr>
+        <w:t xml:space="preserve">Let’s Create a 3D Endless Runner in Unity. </w:t>
+      </w:r>
+      <w:r>
+        <w:t xml:space="preserve">[YouTube video] Available at: </w:t>
+      </w:r>
+      <w:hyperlink r:id="rId10" w:history="1">
+        <w:r>
+          <w:rPr>
+            <w:rStyle w:val="Hyperlink"/>
+          </w:rPr>
+          <w:t>https://www.youtube.com/watch?v=Fn1Pm6nnPVk&amp;list=PL2xbYe8TgQDPsXgVmd8RJdoIJ3eLio7R6</w:t>
+        </w:r>
+      </w:hyperlink>
+      <w:r>
+        <w:t xml:space="preserve"> [Accessed 3 April 2025].</w:t>
+      </w:r>
+    </w:p>
+    <w:p>
+      <w:pPr>
+        <w:pStyle w:val="ListParagraph"/>
+        <w:numPr>
+          <w:ilvl w:val="0"/>
+          <w:numId w:val="1"/>
+        </w:numPr>
+        <w:rPr>
+          <w:b/>
+          <w:bCs/>
+          <w:sz w:val="32"/>
+          <w:szCs w:val="32"/>
+        </w:rPr>
+      </w:pPr>
+      <w:r>
+        <w:t xml:space="preserve">VenCreations, 2017. </w:t>
+      </w:r>
+      <w:r>
+        <w:rPr>
+          <w:i/>
+          <w:iCs/>
+        </w:rPr>
         <w:t xml:space="preserve">SimplePoly City – Low Poly Assets. </w:t>
       </w:r>
       <w:r>
         <w:t xml:space="preserve">[Unity Asset]. Available at: </w:t>
       </w:r>
-      <w:hyperlink r:id="rId9" w:history="1">
+      <w:hyperlink r:id="rId11" w:history="1">
         <w:r>
           <w:rPr>
             <w:rStyle w:val="Hyperlink"/>
@@ -248,10 +347,6 @@
     <w:p>
       <w:pPr>
         <w:pStyle w:val="ListParagraph"/>
-        <w:numPr>
-          <w:ilvl w:val="0"/>
-          <w:numId w:val="1"/>
-        </w:numPr>
         <w:rPr>
           <w:b/>
           <w:bCs/>

</xml_diff>